<commit_message>
updated Instructions in English & Deutsch
</commit_message>
<xml_diff>
--- a/de_Anleitung.docx
+++ b/de_Anleitung.docx
@@ -26,11 +26,14 @@
           <w:ilvl w:val="0"/>
           <w:numId w:val="1"/>
         </w:numPr>
-        <w:rPr>
+        <w:spacing w:before="240" w:after="0" w:line="240" w:lineRule="auto"/>
+        <w:rPr>
+          <w:rStyle w:val="Hyperlink"/>
           <w:rFonts w:ascii="Helvetica" w:hAnsi="Helvetica" w:cs="Helvetica"/>
           <w:color w:val="333333"/>
           <w:sz w:val="20"/>
           <w:szCs w:val="20"/>
+          <w:u w:val="none"/>
           <w:shd w:val="clear" w:color="auto" w:fill="FFFFFF"/>
         </w:rPr>
       </w:pPr>
@@ -53,54 +56,22 @@
             <w:szCs w:val="20"/>
             <w:shd w:val="clear" w:color="auto" w:fill="FFFFFF"/>
           </w:rPr>
-          <w:t>http://www.mediafire.com/</w:t>
-        </w:r>
-        <w:r>
-          <w:rPr>
-            <w:rStyle w:val="Hyperlink"/>
-            <w:rFonts w:ascii="Helvetica" w:hAnsi="Helvetica" w:cs="Helvetica"/>
-            <w:b/>
-            <w:sz w:val="20"/>
-            <w:szCs w:val="20"/>
-            <w:shd w:val="clear" w:color="auto" w:fill="FFFFFF"/>
-          </w:rPr>
-          <w:t>d</w:t>
-        </w:r>
-        <w:r>
-          <w:rPr>
-            <w:rStyle w:val="Hyperlink"/>
-            <w:rFonts w:ascii="Helvetica" w:hAnsi="Helvetica" w:cs="Helvetica"/>
-            <w:b/>
-            <w:sz w:val="20"/>
-            <w:szCs w:val="20"/>
-            <w:shd w:val="clear" w:color="auto" w:fill="FFFFFF"/>
-          </w:rPr>
-          <w:t>ownload/pkmtcw1gb5cgqs6/bfmeResFix_v1.4.0+Final.jar</w:t>
+          <w:t>http://www.mediafire.com/download/pkmtcw1gb5cgqs6/bfmeResFix_v1.4.0+Final.jar</w:t>
         </w:r>
       </w:hyperlink>
     </w:p>
     <w:p>
       <w:pPr>
-        <w:ind w:left="708"/>
-        <w:rPr>
-          <w:i/>
-        </w:rPr>
-      </w:pPr>
-      <w:r>
-        <w:rPr>
-          <w:i/>
-        </w:rPr>
-        <w:t xml:space="preserve">Virengeprüft auf: </w:t>
-      </w:r>
-      <w:hyperlink r:id="rId9" w:history="1">
-        <w:r>
-          <w:rPr>
-            <w:rStyle w:val="Hyperlink"/>
-            <w:i/>
-          </w:rPr>
-          <w:t>https://www.virustotal.com/de/url/f01fafcf82a15e6494b9172f6f97f4065766879cb6c8c12da93c7c5f7f33eb7d/analysis/</w:t>
-        </w:r>
-      </w:hyperlink>
+        <w:pStyle w:val="Listenabsatz"/>
+        <w:spacing w:before="240" w:after="0" w:line="240" w:lineRule="auto"/>
+        <w:rPr>
+          <w:rFonts w:ascii="Helvetica" w:hAnsi="Helvetica" w:cs="Helvetica"/>
+          <w:color w:val="333333"/>
+          <w:sz w:val="20"/>
+          <w:szCs w:val="20"/>
+          <w:shd w:val="clear" w:color="auto" w:fill="FFFFFF"/>
+        </w:rPr>
+      </w:pPr>
     </w:p>
     <w:p>
       <w:r>
@@ -112,9 +83,9 @@
           <w:lang w:eastAsia="de-DE"/>
         </w:rPr>
         <w:drawing>
-          <wp:inline distT="0" distB="0" distL="0" distR="0">
-            <wp:extent cx="4979670" cy="359534"/>
-            <wp:effectExtent l="0" t="0" r="0" b="2540"/>
+          <wp:inline distT="0" distB="0" distL="0" distR="0" wp14:anchorId="017724BB" wp14:editId="6884F90F">
+            <wp:extent cx="5145061" cy="371475"/>
+            <wp:effectExtent l="0" t="0" r="0" b="0"/>
             <wp:docPr id="2" name="Grafik 2"/>
             <wp:cNvGraphicFramePr>
               <a:graphicFrameLocks xmlns:a="http://schemas.openxmlformats.org/drawingml/2006/main" noChangeAspect="1"/>
@@ -127,7 +98,7 @@
                     <pic:cNvPicPr/>
                   </pic:nvPicPr>
                   <pic:blipFill>
-                    <a:blip r:embed="rId10">
+                    <a:blip r:embed="rId9">
                       <a:extLst>
                         <a:ext uri="{28A0092B-C50C-407E-A947-70E740481C1C}">
                           <a14:useLocalDpi xmlns:a14="http://schemas.microsoft.com/office/drawing/2010/main" val="0"/>
@@ -141,7 +112,7 @@
                   <pic:spPr>
                     <a:xfrm>
                       <a:off x="0" y="0"/>
-                      <a:ext cx="5070629" cy="366101"/>
+                      <a:ext cx="5254618" cy="379385"/>
                     </a:xfrm>
                     <a:prstGeom prst="rect">
                       <a:avLst/>
@@ -156,6 +127,7 @@
     </w:p>
     <w:p>
       <w:pPr>
+        <w:spacing w:after="0" w:line="240" w:lineRule="auto"/>
         <w:ind w:left="708"/>
         <w:rPr>
           <w:i/>
@@ -180,7 +152,51 @@
         <w:t xml:space="preserve"> klicken.</w:t>
       </w:r>
     </w:p>
-    <w:p/>
+    <w:p>
+      <w:pPr>
+        <w:spacing w:after="0"/>
+        <w:ind w:left="708"/>
+        <w:rPr>
+          <w:i/>
+        </w:rPr>
+      </w:pPr>
+      <w:r>
+        <w:rPr>
+          <w:i/>
+        </w:rPr>
+        <w:t>Keine Sorge, d</w:t>
+      </w:r>
+      <w:r>
+        <w:rPr>
+          <w:i/>
+        </w:rPr>
+        <w:t>as Programm ist virenfrei</w:t>
+      </w:r>
+      <w:r>
+        <w:rPr>
+          <w:i/>
+        </w:rPr>
+        <w:t xml:space="preserve">: </w:t>
+      </w:r>
+      <w:hyperlink r:id="rId10" w:history="1">
+        <w:r>
+          <w:rPr>
+            <w:rStyle w:val="Hyperlink"/>
+            <w:i/>
+          </w:rPr>
+          <w:t>https://www.virustotal.com/de/url/f01fafcf82a15e6494b9172f6f97f4065766879cb6c8c12da93c7c5f7f33eb7d/analysis/</w:t>
+        </w:r>
+      </w:hyperlink>
+    </w:p>
+    <w:p>
+      <w:pPr>
+        <w:spacing w:after="0"/>
+        <w:ind w:left="708"/>
+        <w:rPr>
+          <w:i/>
+        </w:rPr>
+      </w:pPr>
+    </w:p>
     <w:p>
       <w:pPr>
         <w:pStyle w:val="Listenabsatz"/>
@@ -202,33 +218,12 @@
         <w:rPr>
           <w:b/>
         </w:rPr>
-        <w:t xml:space="preserve"> mit Java </w:t>
-      </w:r>
-      <w:proofErr w:type="spellStart"/>
-      <w:r>
-        <w:rPr>
-          <w:b/>
-        </w:rPr>
-        <w:t>Platform</w:t>
-      </w:r>
-      <w:proofErr w:type="spellEnd"/>
-      <w:r>
-        <w:rPr>
-          <w:b/>
-        </w:rPr>
-        <w:t xml:space="preserve"> SE </w:t>
-      </w:r>
-      <w:proofErr w:type="spellStart"/>
-      <w:r>
-        <w:rPr>
-          <w:b/>
-        </w:rPr>
-        <w:t>binary</w:t>
-      </w:r>
-      <w:proofErr w:type="spellEnd"/>
-    </w:p>
-    <w:p>
-      <w:pPr>
+        <w:t xml:space="preserve"> mit Java Platform SE binary</w:t>
+      </w:r>
+    </w:p>
+    <w:p>
+      <w:pPr>
+        <w:spacing w:line="240" w:lineRule="auto"/>
         <w:ind w:left="708"/>
         <w:rPr>
           <w:i/>
@@ -238,7 +233,20 @@
         <w:rPr>
           <w:i/>
         </w:rPr>
-        <w:t xml:space="preserve">Hierzu benötigst du eventuell eine aktuelle Java-Version: </w:t>
+        <w:t xml:space="preserve">Steht das </w:t>
+      </w:r>
+      <w:r>
+        <w:rPr>
+          <w:i/>
+          <w:u w:val="single"/>
+        </w:rPr>
+        <w:t>nicht</w:t>
+      </w:r>
+      <w:r>
+        <w:rPr>
+          <w:i/>
+        </w:rPr>
+        <w:t xml:space="preserve"> zur Auswahl, so benötigst du eine aktuelle Java-Version: </w:t>
       </w:r>
       <w:hyperlink r:id="rId11" w:history="1">
         <w:r>
@@ -260,8 +268,8 @@
           <w:lang w:eastAsia="de-DE"/>
         </w:rPr>
         <w:drawing>
-          <wp:inline distT="0" distB="0" distL="0" distR="0">
-            <wp:extent cx="5400675" cy="3662363"/>
+          <wp:inline distT="0" distB="0" distL="0" distR="0" wp14:anchorId="017724BD" wp14:editId="71AB3ABD">
+            <wp:extent cx="4953000" cy="2351444"/>
             <wp:effectExtent l="0" t="0" r="0" b="0"/>
             <wp:docPr id="6" name="Grafik 6"/>
             <wp:cNvGraphicFramePr>
@@ -274,7 +282,7 @@
                     <pic:cNvPr id="6" name="open with java.PNG"/>
                     <pic:cNvPicPr/>
                   </pic:nvPicPr>
-                  <pic:blipFill>
+                  <pic:blipFill rotWithShape="1">
                     <a:blip r:embed="rId12">
                       <a:extLst>
                         <a:ext uri="{28A0092B-C50C-407E-A947-70E740481C1C}">
@@ -282,18 +290,25 @@
                         </a:ext>
                       </a:extLst>
                     </a:blip>
-                    <a:stretch>
-                      <a:fillRect/>
-                    </a:stretch>
+                    <a:srcRect b="29991"/>
+                    <a:stretch/>
                   </pic:blipFill>
-                  <pic:spPr>
+                  <pic:spPr bwMode="auto">
                     <a:xfrm>
                       <a:off x="0" y="0"/>
-                      <a:ext cx="5406791" cy="3666510"/>
+                      <a:ext cx="4976594" cy="2362645"/>
                     </a:xfrm>
                     <a:prstGeom prst="rect">
                       <a:avLst/>
                     </a:prstGeom>
+                    <a:ln>
+                      <a:noFill/>
+                    </a:ln>
+                    <a:extLst>
+                      <a:ext uri="{53640926-AAD7-44D8-BBD7-CCE9431645EC}">
+                        <a14:shadowObscured xmlns:a14="http://schemas.microsoft.com/office/drawing/2010/main"/>
+                      </a:ext>
+                    </a:extLst>
                   </pic:spPr>
                 </pic:pic>
               </a:graphicData>
@@ -302,7 +317,16 @@
         </w:drawing>
       </w:r>
     </w:p>
-    <w:p/>
+    <w:p>
+      <w:pPr>
+        <w:pStyle w:val="Listenabsatz"/>
+      </w:pPr>
+    </w:p>
+    <w:p>
+      <w:pPr>
+        <w:pStyle w:val="Listenabsatz"/>
+      </w:pPr>
+    </w:p>
     <w:p>
       <w:pPr>
         <w:pStyle w:val="Listenabsatz"/>
@@ -310,6 +334,7 @@
           <w:ilvl w:val="0"/>
           <w:numId w:val="1"/>
         </w:numPr>
+        <w:spacing w:line="360" w:lineRule="auto"/>
         <w:rPr>
           <w:b/>
         </w:rPr>
@@ -318,368 +343,35 @@
         <w:rPr>
           <w:b/>
         </w:rPr>
-        <w:t xml:space="preserve">Wähle die Sprache in der du </w:t>
+        <w:t xml:space="preserve">Um das richtige Spiel </w:t>
       </w:r>
       <w:r>
         <w:rPr>
           <w:b/>
-          <w:u w:val="single"/>
-        </w:rPr>
-        <w:t>das Spiel installiert</w:t>
+        </w:rPr>
+        <w:t>auszuwählen, klicke dich durch die Tabs</w:t>
       </w:r>
       <w:r>
         <w:rPr>
           <w:b/>
         </w:rPr>
-        <w:t xml:space="preserve"> hast </w:t>
-      </w:r>
-      <w:r>
-        <w:rPr>
-          <w:b/>
-        </w:rPr>
-        <w:t>und deine gewünschte Auflösung.</w:t>
-      </w:r>
-    </w:p>
-    <w:p>
-      <w:pPr>
-        <w:pStyle w:val="Listenabsatz"/>
-        <w:rPr>
-          <w:i/>
-        </w:rPr>
-      </w:pPr>
-      <w:r>
-        <w:rPr>
-          <w:i/>
-        </w:rPr>
-        <w:t>Hinweis</w:t>
-      </w:r>
-      <w:r>
-        <w:rPr>
-          <w:i/>
-        </w:rPr>
-        <w:t>e</w:t>
-      </w:r>
-      <w:r>
-        <w:rPr>
-          <w:i/>
-        </w:rPr>
-        <w:t>:</w:t>
-      </w:r>
-      <w:r>
-        <w:rPr>
-          <w:i/>
-        </w:rPr>
-        <w:t xml:space="preserve"> </w:t>
-      </w:r>
-    </w:p>
-    <w:p>
-      <w:pPr>
-        <w:pStyle w:val="Listenabsatz"/>
-        <w:numPr>
-          <w:ilvl w:val="0"/>
-          <w:numId w:val="2"/>
-        </w:numPr>
-        <w:rPr>
-          <w:i/>
-        </w:rPr>
-      </w:pPr>
-      <w:r>
-        <w:rPr>
-          <w:i/>
-        </w:rPr>
-        <w:t xml:space="preserve">Die </w:t>
-      </w:r>
-      <w:r>
-        <w:rPr>
-          <w:i/>
-        </w:rPr>
-        <w:t>Standart-</w:t>
-      </w:r>
-      <w:r>
-        <w:rPr>
-          <w:i/>
-        </w:rPr>
-        <w:t xml:space="preserve">Auflösung wird automatisch anhand deines </w:t>
-      </w:r>
-      <w:r>
-        <w:rPr>
-          <w:i/>
-        </w:rPr>
-        <w:t>Monitors ermittelt.</w:t>
-      </w:r>
-    </w:p>
-    <w:p>
-      <w:pPr>
-        <w:pStyle w:val="Listenabsatz"/>
-        <w:numPr>
-          <w:ilvl w:val="0"/>
-          <w:numId w:val="2"/>
-        </w:numPr>
-        <w:rPr>
-          <w:b/>
-        </w:rPr>
-      </w:pPr>
-      <w:r>
-        <w:rPr>
-          <w:i/>
-        </w:rPr>
-        <w:t xml:space="preserve">Die ausgewählt Auflösung sollte nicht größer sein als die native Auflösung deines Monitors, da das Spiel kein </w:t>
-      </w:r>
-      <w:proofErr w:type="spellStart"/>
-      <w:r>
-        <w:rPr>
-          <w:i/>
-        </w:rPr>
-        <w:t>Downsampling</w:t>
-      </w:r>
-      <w:proofErr w:type="spellEnd"/>
-      <w:r>
-        <w:rPr>
-          <w:rStyle w:val="Funotenzeichen"/>
-          <w:i/>
-        </w:rPr>
-        <w:footnoteReference w:id="1"/>
-      </w:r>
-      <w:r>
-        <w:rPr>
-          <w:i/>
-        </w:rPr>
-        <w:t xml:space="preserve"> wie DSR</w:t>
-      </w:r>
-      <w:r>
-        <w:rPr>
-          <w:rStyle w:val="Funotenzeichen"/>
-          <w:i/>
-        </w:rPr>
-        <w:footnoteReference w:id="2"/>
-      </w:r>
-      <w:r>
-        <w:rPr>
-          <w:i/>
-        </w:rPr>
-        <w:t xml:space="preserve"> unterstützt.</w:t>
-      </w:r>
-    </w:p>
-    <w:p>
-      <w:pPr>
-        <w:pStyle w:val="Listenabsatz"/>
-        <w:numPr>
-          <w:ilvl w:val="0"/>
-          <w:numId w:val="1"/>
-        </w:numPr>
-        <w:rPr>
-          <w:b/>
-        </w:rPr>
-      </w:pPr>
-      <w:r>
-        <w:rPr>
-          <w:b/>
-        </w:rPr>
-        <w:lastRenderedPageBreak/>
-        <w:t>Be</w:t>
-      </w:r>
-      <w:bookmarkStart w:id="0" w:name="_GoBack"/>
-      <w:bookmarkEnd w:id="0"/>
-      <w:r>
-        <w:rPr>
-          <w:b/>
-        </w:rPr>
-        <w:t>stätige mit „</w:t>
-      </w:r>
-      <w:proofErr w:type="spellStart"/>
-      <w:r>
-        <w:rPr>
-          <w:b/>
-        </w:rPr>
-        <w:t>Apply</w:t>
-      </w:r>
-      <w:proofErr w:type="spellEnd"/>
-      <w:r>
-        <w:rPr>
-          <w:b/>
-        </w:rPr>
-        <w:t xml:space="preserve"> </w:t>
-      </w:r>
-      <w:proofErr w:type="spellStart"/>
-      <w:r>
-        <w:rPr>
-          <w:b/>
-        </w:rPr>
-        <w:t>changes</w:t>
-      </w:r>
-      <w:proofErr w:type="spellEnd"/>
-      <w:r>
-        <w:rPr>
-          <w:b/>
-        </w:rPr>
-        <w:t>“</w:t>
-      </w:r>
-    </w:p>
-    <w:p>
-      <w:pPr>
-        <w:pStyle w:val="Listenabsatz"/>
-        <w:rPr>
-          <w:i/>
-        </w:rPr>
-      </w:pPr>
-      <w:r>
-        <w:rPr>
-          <w:i/>
-        </w:rPr>
-        <w:t>Es</w:t>
-      </w:r>
-      <w:r>
-        <w:rPr>
-          <w:i/>
-        </w:rPr>
-        <w:t xml:space="preserve"> erscheint ein Pop-Up. (siehe</w:t>
-      </w:r>
-      <w:r>
-        <w:rPr>
-          <w:i/>
-        </w:rPr>
-        <w:t xml:space="preserve"> Bild). </w:t>
-      </w:r>
-    </w:p>
-    <w:p>
-      <w:pPr>
-        <w:pStyle w:val="Listenabsatz"/>
-        <w:numPr>
-          <w:ilvl w:val="0"/>
-          <w:numId w:val="2"/>
-        </w:numPr>
-        <w:rPr>
-          <w:i/>
-        </w:rPr>
-      </w:pPr>
-      <w:r>
-        <w:rPr>
-          <w:i/>
-        </w:rPr>
-        <w:t>„</w:t>
-      </w:r>
-      <w:proofErr w:type="spellStart"/>
-      <w:r>
-        <w:rPr>
-          <w:i/>
-        </w:rPr>
-        <w:t>Done</w:t>
-      </w:r>
-      <w:proofErr w:type="spellEnd"/>
-      <w:r>
-        <w:rPr>
-          <w:i/>
-        </w:rPr>
-        <w:t>! (</w:t>
-      </w:r>
-      <w:proofErr w:type="spellStart"/>
-      <w:r>
-        <w:rPr>
-          <w:i/>
-        </w:rPr>
-        <w:t>Created</w:t>
-      </w:r>
-      <w:proofErr w:type="spellEnd"/>
-      <w:r>
-        <w:rPr>
-          <w:i/>
-        </w:rPr>
-        <w:t xml:space="preserve"> + Pfad)“ – Die Datei war </w:t>
-      </w:r>
-      <w:r>
-        <w:rPr>
-          <w:i/>
-          <w:u w:val="single"/>
-        </w:rPr>
-        <w:t>nicht</w:t>
-      </w:r>
-      <w:r>
-        <w:rPr>
-          <w:i/>
-          <w:u w:val="single"/>
-        </w:rPr>
-        <w:t xml:space="preserve"> </w:t>
-      </w:r>
-      <w:r>
-        <w:rPr>
-          <w:i/>
-        </w:rPr>
-        <w:t>vorhanden und wurde erzeugt.</w:t>
-      </w:r>
-    </w:p>
-    <w:p>
-      <w:pPr>
-        <w:pStyle w:val="Listenabsatz"/>
-        <w:numPr>
-          <w:ilvl w:val="0"/>
-          <w:numId w:val="2"/>
-        </w:numPr>
-        <w:rPr>
-          <w:i/>
-        </w:rPr>
-      </w:pPr>
-      <w:r>
-        <w:rPr>
-          <w:i/>
-        </w:rPr>
-        <w:t>„</w:t>
-      </w:r>
-      <w:proofErr w:type="spellStart"/>
-      <w:r>
-        <w:rPr>
-          <w:i/>
-        </w:rPr>
-        <w:t>Done</w:t>
-      </w:r>
-      <w:proofErr w:type="spellEnd"/>
-      <w:r>
-        <w:rPr>
-          <w:i/>
-        </w:rPr>
-        <w:t>! (</w:t>
-      </w:r>
-      <w:proofErr w:type="spellStart"/>
-      <w:r>
-        <w:rPr>
-          <w:i/>
-        </w:rPr>
-        <w:t>Edited</w:t>
-      </w:r>
-      <w:proofErr w:type="spellEnd"/>
-      <w:r>
-        <w:rPr>
-          <w:i/>
-        </w:rPr>
-        <w:t xml:space="preserve"> + Pfad)“ – Die Datei war bereits vorhanden und wurde bearbeitet.</w:t>
-      </w:r>
-    </w:p>
-    <w:p>
-      <w:pPr>
-        <w:pStyle w:val="Listenabsatz"/>
-        <w:ind w:left="1080"/>
-        <w:rPr>
-          <w:i/>
-        </w:rPr>
-      </w:pPr>
-    </w:p>
-    <w:p>
-      <w:pPr>
-        <w:pStyle w:val="Listenabsatz"/>
-        <w:rPr>
-          <w:b/>
-        </w:rPr>
-      </w:pPr>
-      <w:r>
-        <w:rPr>
-          <w:b/>
+        <w:t>.</w:t>
+      </w:r>
+    </w:p>
+    <w:p>
+      <w:pPr>
+        <w:pStyle w:val="Listenabsatz"/>
+      </w:pPr>
+      <w:r>
+        <w:rPr>
           <w:noProof/>
           <w:lang w:eastAsia="de-DE"/>
         </w:rPr>
         <w:drawing>
-          <wp:inline distT="0" distB="0" distL="0" distR="0">
-            <wp:extent cx="4686300" cy="2044574"/>
-            <wp:effectExtent l="0" t="0" r="0" b="0"/>
-            <wp:docPr id="4" name="Grafik 4"/>
+          <wp:inline distT="0" distB="0" distL="0" distR="0" wp14:anchorId="0B13FFBE" wp14:editId="6D48A5FF">
+            <wp:extent cx="4257675" cy="1214794"/>
+            <wp:effectExtent l="0" t="0" r="0" b="4445"/>
+            <wp:docPr id="1" name="Grafik 1"/>
             <wp:cNvGraphicFramePr>
               <a:graphicFrameLocks xmlns:a="http://schemas.openxmlformats.org/drawingml/2006/main" noChangeAspect="1"/>
             </wp:cNvGraphicFramePr>
@@ -687,7 +379,7 @@
               <a:graphicData uri="http://schemas.openxmlformats.org/drawingml/2006/picture">
                 <pic:pic xmlns:pic="http://schemas.openxmlformats.org/drawingml/2006/picture">
                   <pic:nvPicPr>
-                    <pic:cNvPr id="4" name="shopped.png"/>
+                    <pic:cNvPr id="1" name="tabs.PNG"/>
                     <pic:cNvPicPr/>
                   </pic:nvPicPr>
                   <pic:blipFill>
@@ -705,7 +397,7 @@
                   <pic:spPr>
                     <a:xfrm>
                       <a:off x="0" y="0"/>
-                      <a:ext cx="4691426" cy="2046811"/>
+                      <a:ext cx="4346095" cy="1240022"/>
                     </a:xfrm>
                     <a:prstGeom prst="rect">
                       <a:avLst/>
@@ -721,9 +413,6 @@
     <w:p>
       <w:pPr>
         <w:pStyle w:val="Listenabsatz"/>
-        <w:rPr>
-          <w:b/>
-        </w:rPr>
       </w:pPr>
     </w:p>
     <w:p>
@@ -741,152 +430,334 @@
         <w:rPr>
           <w:b/>
         </w:rPr>
-        <w:t>Starte das Spiel</w:t>
-      </w:r>
-    </w:p>
-    <w:p>
-      <w:pPr>
-        <w:pStyle w:val="Listenabsatz"/>
-        <w:rPr>
-          <w:i/>
-        </w:rPr>
-      </w:pPr>
-      <w:r>
-        <w:rPr>
-          <w:i/>
-        </w:rPr>
-        <w:t>Hinweis:</w:t>
-      </w:r>
-    </w:p>
-    <w:p>
-      <w:pPr>
-        <w:pStyle w:val="Listenabsatz"/>
-        <w:rPr>
-          <w:i/>
-        </w:rPr>
-      </w:pPr>
-      <w:r>
-        <w:rPr>
-          <w:i/>
-        </w:rPr>
-        <w:t>Solltest du ein</w:t>
-      </w:r>
-      <w:r>
-        <w:rPr>
-          <w:i/>
-        </w:rPr>
-        <w:t xml:space="preserve">en PC </w:t>
-      </w:r>
-      <w:r>
-        <w:rPr>
-          <w:i/>
-        </w:rPr>
-        <w:t xml:space="preserve">mit </w:t>
-      </w:r>
-      <w:r>
-        <w:rPr>
-          <w:i/>
-        </w:rPr>
-        <w:t>zwei Grafikprozessoren</w:t>
-      </w:r>
-      <w:r>
-        <w:rPr>
-          <w:i/>
-        </w:rPr>
-        <w:t xml:space="preserve"> benutzen so </w:t>
-      </w:r>
-      <w:r>
-        <w:rPr>
-          <w:i/>
-        </w:rPr>
-        <w:t>geh sicher, dass du das Spiel mit deinem dedizierten Grafikprozessor startest. (Im Beispiel: „NVIDIA Hochleistungsprozessor“ wählen).</w:t>
-      </w:r>
-    </w:p>
-    <w:p>
-      <w:pPr>
-        <w:pStyle w:val="Listenabsatz"/>
-        <w:rPr>
-          <w:i/>
-        </w:rPr>
-      </w:pPr>
-      <w:r>
-        <w:rPr>
-          <w:i/>
-        </w:rPr>
-        <w:t>Tipp:</w:t>
-      </w:r>
-    </w:p>
-    <w:p>
-      <w:pPr>
-        <w:pStyle w:val="Listenabsatz"/>
-        <w:rPr>
-          <w:i/>
-        </w:rPr>
-      </w:pPr>
-      <w:r>
-        <w:rPr>
-          <w:i/>
-        </w:rPr>
-        <w:t xml:space="preserve">Patches für die Spiele findest du in meinem </w:t>
-      </w:r>
-      <w:proofErr w:type="spellStart"/>
-      <w:r>
-        <w:rPr>
-          <w:i/>
-        </w:rPr>
-        <w:t>Mediafire</w:t>
-      </w:r>
-      <w:proofErr w:type="spellEnd"/>
-      <w:r>
-        <w:rPr>
-          <w:i/>
-        </w:rPr>
-        <w:t>-Ordner:</w:t>
-      </w:r>
-    </w:p>
-    <w:p>
-      <w:pPr>
-        <w:pStyle w:val="Listenabsatz"/>
-        <w:rPr>
-          <w:i/>
-        </w:rPr>
-      </w:pPr>
-      <w:hyperlink r:id="rId14" w:history="1">
-        <w:r>
-          <w:rPr>
-            <w:rStyle w:val="Hyperlink"/>
-            <w:i/>
-          </w:rPr>
-          <w:t>https://www.mediafire.com/folder/s50wrxf0a7w0s/Patches_for_The_Battle_for_Middle-Earth-Trilogy</w:t>
-        </w:r>
-      </w:hyperlink>
-    </w:p>
-    <w:p>
-      <w:pPr>
-        <w:pStyle w:val="Listenabsatz"/>
-        <w:rPr>
-          <w:i/>
-        </w:rPr>
-      </w:pPr>
-    </w:p>
-    <w:p>
-      <w:pPr>
-        <w:pStyle w:val="Listenabsatz"/>
-        <w:rPr>
-          <w:i/>
-        </w:rPr>
-      </w:pPr>
-      <w:r>
-        <w:rPr>
-          <w:i/>
+        <w:t xml:space="preserve">Wähle die Sprache in der du </w:t>
+      </w:r>
+      <w:r>
+        <w:rPr>
+          <w:b/>
+          <w:u w:val="single"/>
+        </w:rPr>
+        <w:t>das Spiel installiert</w:t>
+      </w:r>
+      <w:r>
+        <w:rPr>
+          <w:b/>
+        </w:rPr>
+        <w:t xml:space="preserve"> hast </w:t>
+      </w:r>
+      <w:r>
+        <w:rPr>
+          <w:b/>
+        </w:rPr>
+        <w:t>und deine gewünschte Auflösung.</w:t>
+      </w:r>
+    </w:p>
+    <w:p>
+      <w:pPr>
+        <w:pStyle w:val="Listenabsatz"/>
+        <w:rPr>
+          <w:i/>
+        </w:rPr>
+      </w:pPr>
+      <w:r>
+        <w:rPr>
+          <w:i/>
+        </w:rPr>
+        <w:t>Hinweis</w:t>
+      </w:r>
+      <w:r>
+        <w:rPr>
+          <w:i/>
+        </w:rPr>
+        <w:t>e</w:t>
+      </w:r>
+      <w:r>
+        <w:rPr>
+          <w:i/>
+        </w:rPr>
+        <w:t>:</w:t>
+      </w:r>
+      <w:r>
+        <w:rPr>
+          <w:i/>
+        </w:rPr>
+        <w:t xml:space="preserve"> </w:t>
+      </w:r>
+    </w:p>
+    <w:p>
+      <w:pPr>
+        <w:pStyle w:val="Listenabsatz"/>
+        <w:numPr>
+          <w:ilvl w:val="0"/>
+          <w:numId w:val="2"/>
+        </w:numPr>
+        <w:rPr>
+          <w:i/>
+        </w:rPr>
+      </w:pPr>
+      <w:r>
+        <w:rPr>
+          <w:i/>
+        </w:rPr>
+        <w:t xml:space="preserve">Die </w:t>
+      </w:r>
+      <w:r>
+        <w:rPr>
+          <w:i/>
+        </w:rPr>
+        <w:t>Standart-</w:t>
+      </w:r>
+      <w:r>
+        <w:rPr>
+          <w:i/>
+        </w:rPr>
+        <w:t xml:space="preserve">Auflösung wird automatisch anhand deines </w:t>
+      </w:r>
+      <w:r>
+        <w:rPr>
+          <w:i/>
+        </w:rPr>
+        <w:t>Monitors ermittelt.</w:t>
+      </w:r>
+    </w:p>
+    <w:p>
+      <w:pPr>
+        <w:pStyle w:val="Listenabsatz"/>
+        <w:numPr>
+          <w:ilvl w:val="0"/>
+          <w:numId w:val="2"/>
+        </w:numPr>
+        <w:rPr>
+          <w:b/>
+        </w:rPr>
+      </w:pPr>
+      <w:r>
+        <w:rPr>
+          <w:i/>
+        </w:rPr>
+        <w:t>Die ausgewählt</w:t>
+      </w:r>
+      <w:r>
+        <w:rPr>
+          <w:i/>
+        </w:rPr>
+        <w:t>e</w:t>
+      </w:r>
+      <w:r>
+        <w:rPr>
+          <w:i/>
+        </w:rPr>
+        <w:t xml:space="preserve"> Auflösung sollte nicht größer sein als die native Auflösung deines Monitors, da das Spiel kein Downsampling</w:t>
+      </w:r>
+      <w:r>
+        <w:rPr>
+          <w:rStyle w:val="Funotenzeichen"/>
+          <w:i/>
+        </w:rPr>
+        <w:footnoteReference w:id="1"/>
+      </w:r>
+      <w:r>
+        <w:rPr>
+          <w:i/>
+        </w:rPr>
+        <w:t xml:space="preserve"> wie DSR</w:t>
+      </w:r>
+      <w:r>
+        <w:rPr>
+          <w:rStyle w:val="Funotenzeichen"/>
+          <w:i/>
+        </w:rPr>
+        <w:footnoteReference w:id="2"/>
+      </w:r>
+      <w:r>
+        <w:rPr>
+          <w:i/>
+        </w:rPr>
+        <w:t xml:space="preserve"> unterstützt.</w:t>
+      </w:r>
+    </w:p>
+    <w:p>
+      <w:pPr>
+        <w:pStyle w:val="Listenabsatz"/>
+        <w:numPr>
+          <w:ilvl w:val="0"/>
+          <w:numId w:val="1"/>
+        </w:numPr>
+        <w:rPr>
+          <w:b/>
+        </w:rPr>
+      </w:pPr>
+      <w:r>
+        <w:rPr>
+          <w:b/>
+        </w:rPr>
+        <w:lastRenderedPageBreak/>
+        <w:t>Bestätige mit „Apply changes“</w:t>
+      </w:r>
+    </w:p>
+    <w:p>
+      <w:pPr>
+        <w:pStyle w:val="Listenabsatz"/>
+        <w:rPr>
+          <w:i/>
+        </w:rPr>
+      </w:pPr>
+      <w:r>
+        <w:rPr>
+          <w:i/>
+        </w:rPr>
+        <w:t>Es</w:t>
+      </w:r>
+      <w:r>
+        <w:rPr>
+          <w:i/>
+        </w:rPr>
+        <w:t xml:space="preserve"> erscheint ein Pop-Up.</w:t>
+      </w:r>
+      <w:r>
+        <w:rPr>
+          <w:i/>
+        </w:rPr>
+        <w:t xml:space="preserve"> (siehe</w:t>
+      </w:r>
+      <w:r>
+        <w:rPr>
+          <w:i/>
+        </w:rPr>
+        <w:t xml:space="preserve"> Bild)</w:t>
+      </w:r>
+    </w:p>
+    <w:p>
+      <w:pPr>
+        <w:pStyle w:val="Listenabsatz"/>
+        <w:numPr>
+          <w:ilvl w:val="0"/>
+          <w:numId w:val="2"/>
+        </w:numPr>
+        <w:rPr>
+          <w:i/>
+        </w:rPr>
+      </w:pPr>
+      <w:r>
+        <w:rPr>
+          <w:i/>
+        </w:rPr>
+        <w:t>„Done! (Created</w:t>
+      </w:r>
+      <w:r>
+        <w:rPr>
+          <w:i/>
+        </w:rPr>
+        <w:t xml:space="preserve"> + Pfad)“ – Die Datei war </w:t>
+      </w:r>
+      <w:r>
+        <w:rPr>
+          <w:i/>
+          <w:u w:val="single"/>
+        </w:rPr>
+        <w:t>nicht</w:t>
+      </w:r>
+      <w:r>
+        <w:rPr>
+          <w:i/>
+          <w:u w:val="single"/>
+        </w:rPr>
+        <w:t xml:space="preserve"> </w:t>
+      </w:r>
+      <w:r>
+        <w:rPr>
+          <w:i/>
+        </w:rPr>
+        <w:t>vorhanden und wurde erzeugt.</w:t>
+      </w:r>
+    </w:p>
+    <w:p>
+      <w:pPr>
+        <w:pStyle w:val="Listenabsatz"/>
+        <w:numPr>
+          <w:ilvl w:val="0"/>
+          <w:numId w:val="2"/>
+        </w:numPr>
+        <w:rPr>
+          <w:i/>
+        </w:rPr>
+      </w:pPr>
+      <w:r>
+        <w:rPr>
+          <w:i/>
+        </w:rPr>
+        <w:t>„Done! (Edited + Pfad)“ – Die Datei war bereits vorhanden und wurde bearbeitet.</w:t>
+      </w:r>
+    </w:p>
+    <w:p>
+      <w:pPr>
+        <w:pStyle w:val="Listenabsatz"/>
+        <w:numPr>
+          <w:ilvl w:val="0"/>
+          <w:numId w:val="2"/>
+        </w:numPr>
+        <w:rPr>
+          <w:i/>
+        </w:rPr>
+      </w:pPr>
+      <w:r>
+        <w:rPr>
+          <w:i/>
+        </w:rPr>
+        <w:t xml:space="preserve">Wiederhole die Schritte </w:t>
+      </w:r>
+      <w:r>
+        <w:rPr>
+          <w:i/>
+        </w:rPr>
+        <w:t xml:space="preserve">4 und 5 </w:t>
+      </w:r>
+      <w:r>
+        <w:rPr>
+          <w:i/>
+        </w:rPr>
+        <w:t xml:space="preserve">für </w:t>
+      </w:r>
+      <w:r>
+        <w:rPr>
+          <w:i/>
+        </w:rPr>
+        <w:t>jeden „Schlacht um Mittelerde“-Teil</w:t>
+      </w:r>
+      <w:r>
+        <w:rPr>
+          <w:i/>
+        </w:rPr>
+        <w:t>.</w:t>
+      </w:r>
+    </w:p>
+    <w:p>
+      <w:pPr>
+        <w:pStyle w:val="Listenabsatz"/>
+        <w:ind w:left="1080"/>
+        <w:rPr>
+          <w:i/>
+        </w:rPr>
+      </w:pPr>
+    </w:p>
+    <w:p>
+      <w:pPr>
+        <w:pStyle w:val="Listenabsatz"/>
+        <w:rPr>
+          <w:b/>
+        </w:rPr>
+      </w:pPr>
+      <w:r>
+        <w:rPr>
+          <w:b/>
           <w:noProof/>
           <w:lang w:eastAsia="de-DE"/>
         </w:rPr>
         <w:drawing>
-          <wp:inline distT="0" distB="0" distL="0" distR="0">
-            <wp:extent cx="5086350" cy="3363427"/>
-            <wp:effectExtent l="0" t="0" r="0" b="8890"/>
-            <wp:docPr id="5" name="Grafik 5"/>
+          <wp:inline distT="0" distB="0" distL="0" distR="0" wp14:anchorId="017724BF" wp14:editId="054A5AE3">
+            <wp:extent cx="5057775" cy="2206644"/>
+            <wp:effectExtent l="0" t="0" r="0" b="3175"/>
+            <wp:docPr id="4" name="Grafik 4"/>
             <wp:cNvGraphicFramePr>
               <a:graphicFrameLocks xmlns:a="http://schemas.openxmlformats.org/drawingml/2006/main" noChangeAspect="1"/>
             </wp:cNvGraphicFramePr>
@@ -894,11 +765,11 @@
               <a:graphicData uri="http://schemas.openxmlformats.org/drawingml/2006/picture">
                 <pic:pic xmlns:pic="http://schemas.openxmlformats.org/drawingml/2006/picture">
                   <pic:nvPicPr>
-                    <pic:cNvPr id="5" name="4.PNG"/>
+                    <pic:cNvPr id="4" name="shopped.png"/>
                     <pic:cNvPicPr/>
                   </pic:nvPicPr>
                   <pic:blipFill>
-                    <a:blip r:embed="rId15">
+                    <a:blip r:embed="rId14">
                       <a:extLst>
                         <a:ext uri="{28A0092B-C50C-407E-A947-70E740481C1C}">
                           <a14:useLocalDpi xmlns:a14="http://schemas.microsoft.com/office/drawing/2010/main" val="0"/>
@@ -912,7 +783,7 @@
                   <pic:spPr>
                     <a:xfrm>
                       <a:off x="0" y="0"/>
-                      <a:ext cx="5088363" cy="3364758"/>
+                      <a:ext cx="5083566" cy="2217896"/>
                     </a:xfrm>
                     <a:prstGeom prst="rect">
                       <a:avLst/>
@@ -927,6 +798,249 @@
     </w:p>
     <w:p>
       <w:pPr>
+        <w:pStyle w:val="Listenabsatz"/>
+        <w:rPr>
+          <w:b/>
+        </w:rPr>
+      </w:pPr>
+    </w:p>
+    <w:p>
+      <w:pPr>
+        <w:pStyle w:val="Listenabsatz"/>
+        <w:numPr>
+          <w:ilvl w:val="0"/>
+          <w:numId w:val="1"/>
+        </w:numPr>
+        <w:rPr>
+          <w:b/>
+        </w:rPr>
+      </w:pPr>
+      <w:r>
+        <w:rPr>
+          <w:b/>
+        </w:rPr>
+        <w:t>Starte das Spiel</w:t>
+      </w:r>
+    </w:p>
+    <w:p>
+      <w:pPr>
+        <w:pStyle w:val="Listenabsatz"/>
+        <w:rPr>
+          <w:i/>
+        </w:rPr>
+      </w:pPr>
+      <w:r>
+        <w:rPr>
+          <w:i/>
+        </w:rPr>
+        <w:t>Hinweis:</w:t>
+      </w:r>
+    </w:p>
+    <w:p>
+      <w:pPr>
+        <w:pStyle w:val="Listenabsatz"/>
+        <w:rPr>
+          <w:i/>
+        </w:rPr>
+      </w:pPr>
+      <w:r>
+        <w:rPr>
+          <w:i/>
+        </w:rPr>
+        <w:t>Solltest du ein</w:t>
+      </w:r>
+      <w:r>
+        <w:rPr>
+          <w:i/>
+        </w:rPr>
+        <w:t xml:space="preserve">en PC </w:t>
+      </w:r>
+      <w:r>
+        <w:rPr>
+          <w:i/>
+        </w:rPr>
+        <w:t xml:space="preserve">mit </w:t>
+      </w:r>
+      <w:r>
+        <w:rPr>
+          <w:i/>
+        </w:rPr>
+        <w:t>zwei Grafikprozessoren</w:t>
+      </w:r>
+      <w:r>
+        <w:rPr>
+          <w:i/>
+        </w:rPr>
+        <w:t xml:space="preserve"> benutzen</w:t>
+      </w:r>
+      <w:r>
+        <w:rPr>
+          <w:i/>
+        </w:rPr>
+        <w:t>,</w:t>
+      </w:r>
+      <w:r>
+        <w:rPr>
+          <w:i/>
+        </w:rPr>
+        <w:t xml:space="preserve"> so </w:t>
+      </w:r>
+      <w:r>
+        <w:rPr>
+          <w:i/>
+        </w:rPr>
+        <w:t>geh sicher, dass du das Spiel mit deinem dedizierten Grafikprozessor startest</w:t>
+      </w:r>
+      <w:r>
+        <w:rPr>
+          <w:i/>
+        </w:rPr>
+        <w:t>, da es sonst zu Abstürzen kommen kann</w:t>
+      </w:r>
+      <w:r>
+        <w:rPr>
+          <w:i/>
+        </w:rPr>
+        <w:t>. (Im Beispiel: „NVIDIA Hochleistungsprozessor“ wählen).</w:t>
+      </w:r>
+    </w:p>
+    <w:p>
+      <w:pPr>
+        <w:pStyle w:val="Listenabsatz"/>
+        <w:rPr>
+          <w:i/>
+          <w:noProof/>
+          <w:lang w:eastAsia="de-DE"/>
+        </w:rPr>
+      </w:pPr>
+    </w:p>
+    <w:p>
+      <w:pPr>
+        <w:pStyle w:val="Listenabsatz"/>
+        <w:rPr>
+          <w:i/>
+        </w:rPr>
+      </w:pPr>
+      <w:r>
+        <w:rPr>
+          <w:i/>
+          <w:noProof/>
+          <w:lang w:eastAsia="de-DE"/>
+        </w:rPr>
+        <w:drawing>
+          <wp:inline distT="0" distB="0" distL="0" distR="0" wp14:anchorId="017724C1" wp14:editId="4D82AF35">
+            <wp:extent cx="5700395" cy="1473269"/>
+            <wp:effectExtent l="0" t="0" r="0" b="0"/>
+            <wp:docPr id="5" name="Grafik 5"/>
+            <wp:cNvGraphicFramePr>
+              <a:graphicFrameLocks xmlns:a="http://schemas.openxmlformats.org/drawingml/2006/main" noChangeAspect="1"/>
+            </wp:cNvGraphicFramePr>
+            <a:graphic xmlns:a="http://schemas.openxmlformats.org/drawingml/2006/main">
+              <a:graphicData uri="http://schemas.openxmlformats.org/drawingml/2006/picture">
+                <pic:pic xmlns:pic="http://schemas.openxmlformats.org/drawingml/2006/picture">
+                  <pic:nvPicPr>
+                    <pic:cNvPr id="5" name="4.PNG"/>
+                    <pic:cNvPicPr/>
+                  </pic:nvPicPr>
+                  <pic:blipFill rotWithShape="1">
+                    <a:blip r:embed="rId15">
+                      <a:extLst>
+                        <a:ext uri="{28A0092B-C50C-407E-A947-70E740481C1C}">
+                          <a14:useLocalDpi xmlns:a14="http://schemas.microsoft.com/office/drawing/2010/main" val="0"/>
+                        </a:ext>
+                      </a:extLst>
+                    </a:blip>
+                    <a:srcRect b="60916"/>
+                    <a:stretch/>
+                  </pic:blipFill>
+                  <pic:spPr bwMode="auto">
+                    <a:xfrm>
+                      <a:off x="0" y="0"/>
+                      <a:ext cx="5901863" cy="1525338"/>
+                    </a:xfrm>
+                    <a:prstGeom prst="rect">
+                      <a:avLst/>
+                    </a:prstGeom>
+                    <a:ln>
+                      <a:noFill/>
+                    </a:ln>
+                    <a:extLst>
+                      <a:ext uri="{53640926-AAD7-44D8-BBD7-CCE9431645EC}">
+                        <a14:shadowObscured xmlns:a14="http://schemas.microsoft.com/office/drawing/2010/main"/>
+                      </a:ext>
+                    </a:extLst>
+                  </pic:spPr>
+                </pic:pic>
+              </a:graphicData>
+            </a:graphic>
+          </wp:inline>
+        </w:drawing>
+      </w:r>
+    </w:p>
+    <w:p>
+      <w:pPr>
+        <w:pStyle w:val="Listenabsatz"/>
+        <w:rPr>
+          <w:i/>
+        </w:rPr>
+      </w:pPr>
+    </w:p>
+    <w:p>
+      <w:pPr>
+        <w:pStyle w:val="Listenabsatz"/>
+        <w:rPr>
+          <w:i/>
+        </w:rPr>
+      </w:pPr>
+      <w:r>
+        <w:rPr>
+          <w:i/>
+        </w:rPr>
+        <w:t xml:space="preserve">Tipp: </w:t>
+      </w:r>
+    </w:p>
+    <w:p>
+      <w:pPr>
+        <w:pStyle w:val="Listenabsatz"/>
+        <w:rPr>
+          <w:i/>
+        </w:rPr>
+      </w:pPr>
+      <w:r>
+        <w:rPr>
+          <w:i/>
+        </w:rPr>
+        <w:t>Patches für die Spiele findest du in meinem Mediafire-Ordner:</w:t>
+      </w:r>
+    </w:p>
+    <w:p>
+      <w:pPr>
+        <w:pStyle w:val="Listenabsatz"/>
+        <w:rPr>
+          <w:rStyle w:val="Hyperlink"/>
+          <w:i/>
+        </w:rPr>
+      </w:pPr>
+      <w:hyperlink r:id="rId16" w:history="1">
+        <w:r>
+          <w:rPr>
+            <w:rStyle w:val="Hyperlink"/>
+            <w:i/>
+          </w:rPr>
+          <w:t>https://www.mediafire.com/folder/s50wrxf0a7w0s/Patches_for_The_Battle_for_Middle-Earth-Trilogy</w:t>
+        </w:r>
+      </w:hyperlink>
+    </w:p>
+    <w:p>
+      <w:pPr>
+        <w:pStyle w:val="Listenabsatz"/>
+        <w:rPr>
+          <w:i/>
+        </w:rPr>
+      </w:pPr>
+    </w:p>
+    <w:p>
+      <w:pPr>
         <w:ind w:firstLine="708"/>
         <w:rPr>
           <w:i/>
@@ -936,9 +1050,17 @@
         <w:rPr>
           <w:i/>
         </w:rPr>
-        <w:t xml:space="preserve">Hast du weitere Fragen? Schreib mir eine E-Mail an: </w:t>
-      </w:r>
-      <w:hyperlink r:id="rId16" w:history="1">
+        <w:t>Hast du weitere Fragen? Schreib mir ei</w:t>
+      </w:r>
+      <w:bookmarkStart w:id="0" w:name="_GoBack"/>
+      <w:bookmarkEnd w:id="0"/>
+      <w:r>
+        <w:rPr>
+          <w:i/>
+        </w:rPr>
+        <w:t xml:space="preserve">ne E-Mail an: </w:t>
+      </w:r>
+      <w:hyperlink r:id="rId17" w:history="1">
         <w:r>
           <w:rPr>
             <w:rStyle w:val="Hyperlink"/>
@@ -949,12 +1071,12 @@
       </w:hyperlink>
     </w:p>
     <w:sectPr>
-      <w:headerReference w:type="even" r:id="rId17"/>
-      <w:headerReference w:type="default" r:id="rId18"/>
-      <w:footerReference w:type="even" r:id="rId19"/>
-      <w:footerReference w:type="default" r:id="rId20"/>
-      <w:headerReference w:type="first" r:id="rId21"/>
-      <w:footerReference w:type="first" r:id="rId22"/>
+      <w:headerReference w:type="even" r:id="rId18"/>
+      <w:headerReference w:type="default" r:id="rId19"/>
+      <w:footerReference w:type="even" r:id="rId20"/>
+      <w:footerReference w:type="default" r:id="rId21"/>
+      <w:headerReference w:type="first" r:id="rId22"/>
+      <w:footerReference w:type="first" r:id="rId23"/>
       <w:pgSz w:w="11906" w:h="16838"/>
       <w:pgMar w:top="1417" w:right="1417" w:bottom="1134" w:left="1417" w:header="708" w:footer="708" w:gutter="0"/>
       <w:cols w:space="708"/>
@@ -2171,7 +2293,7 @@
 </file>
 
 <file path=customXml/itemProps1.xml><?xml version="1.0" encoding="utf-8"?>
-<ds:datastoreItem xmlns:ds="http://schemas.openxmlformats.org/officeDocument/2006/customXml" ds:itemID="{97BF9554-0626-41A4-83A6-11C69326FCB3}">
+<ds:datastoreItem xmlns:ds="http://schemas.openxmlformats.org/officeDocument/2006/customXml" ds:itemID="{15FEEFCA-EC88-4741-93F9-B35EA2E79C02}">
   <ds:schemaRefs>
     <ds:schemaRef ds:uri="http://schemas.openxmlformats.org/officeDocument/2006/bibliography"/>
   </ds:schemaRefs>

</xml_diff>

<commit_message>
Final 2 (1.5.0 Date: 13.08.2015)
</commit_message>
<xml_diff>
--- a/de_Anleitung.docx
+++ b/de_Anleitung.docx
@@ -41,7 +41,19 @@
         <w:rPr>
           <w:b/>
         </w:rPr>
-        <w:t>Lade dir die Java-.jar-Datei runter:</w:t>
+        <w:t xml:space="preserve">Lade dir die </w:t>
+      </w:r>
+      <w:r>
+        <w:rPr>
+          <w:b/>
+        </w:rPr>
+        <w:t xml:space="preserve">aktuelle </w:t>
+      </w:r>
+      <w:r>
+        <w:rPr>
+          <w:b/>
+        </w:rPr>
+        <w:t>Java-.jar-Datei runter:</w:t>
       </w:r>
       <w:r>
         <w:t xml:space="preserve"> </w:t>
@@ -50,13 +62,9 @@
         <w:r>
           <w:rPr>
             <w:rStyle w:val="Hyperlink"/>
-            <w:rFonts w:ascii="Helvetica" w:hAnsi="Helvetica" w:cs="Helvetica"/>
             <w:b/>
-            <w:sz w:val="20"/>
-            <w:szCs w:val="20"/>
-            <w:shd w:val="clear" w:color="auto" w:fill="FFFFFF"/>
           </w:rPr>
-          <w:t>http://www.mediafire.com/download/pkmtcw1gb5cgqs6/bfmeResFix_v1.4.0+Final.jar</w:t>
+          <w:t>https://www.mediafire.com/#5qvyz9eb03d7i</w:t>
         </w:r>
       </w:hyperlink>
     </w:p>
@@ -176,7 +184,7 @@
         <w:rPr>
           <w:i/>
         </w:rPr>
-        <w:t xml:space="preserve">: </w:t>
+        <w:t xml:space="preserve">, teste es bei </w:t>
       </w:r>
       <w:hyperlink r:id="rId10" w:history="1">
         <w:r>
@@ -184,9 +192,15 @@
             <w:rStyle w:val="Hyperlink"/>
             <w:i/>
           </w:rPr>
-          <w:t>https://www.virustotal.com/de/url/f01fafcf82a15e6494b9172f6f97f4065766879cb6c8c12da93c7c5f7f33eb7d/analysis/</w:t>
+          <w:t>https://www.virustotal.com/de/</w:t>
         </w:r>
       </w:hyperlink>
+      <w:r>
+        <w:rPr>
+          <w:i/>
+        </w:rPr>
+        <w:t xml:space="preserve"> wenn du dir trotzdem unsicher bist.</w:t>
+      </w:r>
     </w:p>
     <w:p>
       <w:pPr>
@@ -368,10 +382,10 @@
           <w:lang w:eastAsia="de-DE"/>
         </w:rPr>
         <w:drawing>
-          <wp:inline distT="0" distB="0" distL="0" distR="0" wp14:anchorId="0B13FFBE" wp14:editId="6D48A5FF">
-            <wp:extent cx="4257675" cy="1214794"/>
-            <wp:effectExtent l="0" t="0" r="0" b="4445"/>
-            <wp:docPr id="1" name="Grafik 1"/>
+          <wp:inline distT="0" distB="0" distL="0" distR="0" wp14:anchorId="2C0567F6" wp14:editId="4B703E85">
+            <wp:extent cx="5158596" cy="1422566"/>
+            <wp:effectExtent l="0" t="0" r="4445" b="6350"/>
+            <wp:docPr id="3" name="Grafik 3"/>
             <wp:cNvGraphicFramePr>
               <a:graphicFrameLocks xmlns:a="http://schemas.openxmlformats.org/drawingml/2006/main" noChangeAspect="1"/>
             </wp:cNvGraphicFramePr>
@@ -379,7 +393,7 @@
               <a:graphicData uri="http://schemas.openxmlformats.org/drawingml/2006/picture">
                 <pic:pic xmlns:pic="http://schemas.openxmlformats.org/drawingml/2006/picture">
                   <pic:nvPicPr>
-                    <pic:cNvPr id="1" name="tabs.PNG"/>
+                    <pic:cNvPr id="3" name="de1.PNG"/>
                     <pic:cNvPicPr/>
                   </pic:nvPicPr>
                   <pic:blipFill>
@@ -397,7 +411,7 @@
                   <pic:spPr>
                     <a:xfrm>
                       <a:off x="0" y="0"/>
-                      <a:ext cx="4346095" cy="1240022"/>
+                      <a:ext cx="5344489" cy="1473829"/>
                     </a:xfrm>
                     <a:prstGeom prst="rect">
                       <a:avLst/>
@@ -592,7 +606,19 @@
           <w:b/>
         </w:rPr>
         <w:lastRenderedPageBreak/>
-        <w:t>Bestätige mit „Apply changes“</w:t>
+        <w:t>Bestätige mit „</w:t>
+      </w:r>
+      <w:r>
+        <w:rPr>
+          <w:b/>
+        </w:rPr>
+        <w:t>Übernehmen</w:t>
+      </w:r>
+      <w:r>
+        <w:rPr>
+          <w:b/>
+        </w:rPr>
+        <w:t>“</w:t>
       </w:r>
     </w:p>
     <w:p>
@@ -626,6 +652,8 @@
         </w:rPr>
         <w:t xml:space="preserve"> Bild)</w:t>
       </w:r>
+      <w:bookmarkStart w:id="0" w:name="_GoBack"/>
+      <w:bookmarkEnd w:id="0"/>
     </w:p>
     <w:p>
       <w:pPr>
@@ -642,7 +670,25 @@
         <w:rPr>
           <w:i/>
         </w:rPr>
-        <w:t>„Done! (Created</w:t>
+        <w:t>„</w:t>
+      </w:r>
+      <w:r>
+        <w:rPr>
+          <w:i/>
+        </w:rPr>
+        <w:t>Fertig</w:t>
+      </w:r>
+      <w:r>
+        <w:rPr>
+          <w:i/>
+        </w:rPr>
+        <w:t>! (</w:t>
+      </w:r>
+      <w:r>
+        <w:rPr>
+          <w:i/>
+        </w:rPr>
+        <w:t>Erzeugt:</w:t>
       </w:r>
       <w:r>
         <w:rPr>
@@ -686,7 +732,37 @@
         <w:rPr>
           <w:i/>
         </w:rPr>
-        <w:t>„Done! (Edited + Pfad)“ – Die Datei war bereits vorhanden und wurde bearbeitet.</w:t>
+        <w:t>„</w:t>
+      </w:r>
+      <w:r>
+        <w:rPr>
+          <w:i/>
+        </w:rPr>
+        <w:t>Fertig</w:t>
+      </w:r>
+      <w:r>
+        <w:rPr>
+          <w:i/>
+        </w:rPr>
+        <w:t>! (</w:t>
+      </w:r>
+      <w:r>
+        <w:rPr>
+          <w:i/>
+        </w:rPr>
+        <w:t>Bearbeitet</w:t>
+      </w:r>
+      <w:r>
+        <w:rPr>
+          <w:i/>
+        </w:rPr>
+        <w:t>:</w:t>
+      </w:r>
+      <w:r>
+        <w:rPr>
+          <w:i/>
+        </w:rPr>
+        <w:t xml:space="preserve"> + Pfad)“ – Die Datei war bereits vorhanden und wurde bearbeitet.</w:t>
       </w:r>
     </w:p>
     <w:p>
@@ -754,10 +830,10 @@
           <w:lang w:eastAsia="de-DE"/>
         </w:rPr>
         <w:drawing>
-          <wp:inline distT="0" distB="0" distL="0" distR="0" wp14:anchorId="017724BF" wp14:editId="054A5AE3">
-            <wp:extent cx="5057775" cy="2206644"/>
-            <wp:effectExtent l="0" t="0" r="0" b="3175"/>
-            <wp:docPr id="4" name="Grafik 4"/>
+          <wp:inline distT="0" distB="0" distL="0" distR="0" wp14:anchorId="098199EB" wp14:editId="586A13D6">
+            <wp:extent cx="5463617" cy="2372265"/>
+            <wp:effectExtent l="0" t="0" r="3810" b="9525"/>
+            <wp:docPr id="8" name="Grafik 8"/>
             <wp:cNvGraphicFramePr>
               <a:graphicFrameLocks xmlns:a="http://schemas.openxmlformats.org/drawingml/2006/main" noChangeAspect="1"/>
             </wp:cNvGraphicFramePr>
@@ -765,7 +841,7 @@
               <a:graphicData uri="http://schemas.openxmlformats.org/drawingml/2006/picture">
                 <pic:pic xmlns:pic="http://schemas.openxmlformats.org/drawingml/2006/picture">
                   <pic:nvPicPr>
-                    <pic:cNvPr id="4" name="shopped.png"/>
+                    <pic:cNvPr id="8" name="de2.PNG"/>
                     <pic:cNvPicPr/>
                   </pic:nvPicPr>
                   <pic:blipFill>
@@ -783,7 +859,7 @@
                   <pic:spPr>
                     <a:xfrm>
                       <a:off x="0" y="0"/>
-                      <a:ext cx="5083566" cy="2217896"/>
+                      <a:ext cx="5468770" cy="2374503"/>
                     </a:xfrm>
                     <a:prstGeom prst="rect">
                       <a:avLst/>
@@ -895,7 +971,13 @@
         <w:rPr>
           <w:i/>
         </w:rPr>
-        <w:t>, da es sonst zu Abstürzen kommen kann</w:t>
+        <w:t>, da es sonst zu Abstürzen kommen k</w:t>
+      </w:r>
+      <w:r>
+        <w:rPr>
+          <w:i/>
+        </w:rPr>
+        <w:t>önnte</w:t>
       </w:r>
       <w:r>
         <w:rPr>
@@ -928,10 +1010,10 @@
           <w:lang w:eastAsia="de-DE"/>
         </w:rPr>
         <w:drawing>
-          <wp:inline distT="0" distB="0" distL="0" distR="0" wp14:anchorId="017724C1" wp14:editId="4D82AF35">
-            <wp:extent cx="5700395" cy="1473269"/>
+          <wp:inline distT="0" distB="0" distL="0" distR="0" wp14:anchorId="0FF18C41" wp14:editId="1EC92C01">
+            <wp:extent cx="5944188" cy="1354347"/>
             <wp:effectExtent l="0" t="0" r="0" b="0"/>
-            <wp:docPr id="5" name="Grafik 5"/>
+            <wp:docPr id="7" name="Grafik 7"/>
             <wp:cNvGraphicFramePr>
               <a:graphicFrameLocks xmlns:a="http://schemas.openxmlformats.org/drawingml/2006/main" noChangeAspect="1"/>
             </wp:cNvGraphicFramePr>
@@ -939,10 +1021,10 @@
               <a:graphicData uri="http://schemas.openxmlformats.org/drawingml/2006/picture">
                 <pic:pic xmlns:pic="http://schemas.openxmlformats.org/drawingml/2006/picture">
                   <pic:nvPicPr>
-                    <pic:cNvPr id="5" name="4.PNG"/>
+                    <pic:cNvPr id="7" name="de3.PNG"/>
                     <pic:cNvPicPr/>
                   </pic:nvPicPr>
-                  <pic:blipFill rotWithShape="1">
+                  <pic:blipFill>
                     <a:blip r:embed="rId15">
                       <a:extLst>
                         <a:ext uri="{28A0092B-C50C-407E-A947-70E740481C1C}">
@@ -950,25 +1032,18 @@
                         </a:ext>
                       </a:extLst>
                     </a:blip>
-                    <a:srcRect b="60916"/>
-                    <a:stretch/>
+                    <a:stretch>
+                      <a:fillRect/>
+                    </a:stretch>
                   </pic:blipFill>
-                  <pic:spPr bwMode="auto">
+                  <pic:spPr>
                     <a:xfrm>
                       <a:off x="0" y="0"/>
-                      <a:ext cx="5901863" cy="1525338"/>
+                      <a:ext cx="5947406" cy="1355080"/>
                     </a:xfrm>
                     <a:prstGeom prst="rect">
                       <a:avLst/>
                     </a:prstGeom>
-                    <a:ln>
-                      <a:noFill/>
-                    </a:ln>
-                    <a:extLst>
-                      <a:ext uri="{53640926-AAD7-44D8-BBD7-CCE9431645EC}">
-                        <a14:shadowObscured xmlns:a14="http://schemas.microsoft.com/office/drawing/2010/main"/>
-                      </a:ext>
-                    </a:extLst>
                   </pic:spPr>
                 </pic:pic>
               </a:graphicData>
@@ -1050,15 +1125,7 @@
         <w:rPr>
           <w:i/>
         </w:rPr>
-        <w:t>Hast du weitere Fragen? Schreib mir ei</w:t>
-      </w:r>
-      <w:bookmarkStart w:id="0" w:name="_GoBack"/>
-      <w:bookmarkEnd w:id="0"/>
-      <w:r>
-        <w:rPr>
-          <w:i/>
-        </w:rPr>
-        <w:t xml:space="preserve">ne E-Mail an: </w:t>
+        <w:t xml:space="preserve">Hast du weitere Fragen? Schreib mir eine E-Mail an: </w:t>
       </w:r>
       <w:hyperlink r:id="rId17" w:history="1">
         <w:r>
@@ -2293,7 +2360,7 @@
 </file>
 
 <file path=customXml/itemProps1.xml><?xml version="1.0" encoding="utf-8"?>
-<ds:datastoreItem xmlns:ds="http://schemas.openxmlformats.org/officeDocument/2006/customXml" ds:itemID="{15FEEFCA-EC88-4741-93F9-B35EA2E79C02}">
+<ds:datastoreItem xmlns:ds="http://schemas.openxmlformats.org/officeDocument/2006/customXml" ds:itemID="{8C5E031D-E301-4842-B7B6-D945AC5A4358}">
   <ds:schemaRefs>
     <ds:schemaRef ds:uri="http://schemas.openxmlformats.org/officeDocument/2006/bibliography"/>
   </ds:schemaRefs>

</xml_diff>